<commit_message>
Add comprehensive reviewer supplement PDF
</commit_message>
<xml_diff>
--- a/paper_artifacts/CACIC_2026_Supplementary_Material.docx
+++ b/paper_artifacts/CACIC_2026_Supplementary_Material.docx
@@ -813,6 +813,713 @@
         <w:tblLook w:firstColumn="1" w:firstRow="1" w:lastColumn="0" w:lastRow="0" w:noHBand="0" w:noVBand="1" w:val="04A0"/>
       </w:tblPr>
       <w:tblGrid>
+        <w:gridCol w:w="2541"/>
+        <w:gridCol w:w="2541"/>
+        <w:gridCol w:w="2541"/>
+        <w:gridCol w:w="2541"/>
+      </w:tblGrid>
+      <w:tr>
+        <w:tc>
+          <w:tcPr>
+            <w:tcW w:type="dxa" w:w="792"/>
+            <w:shd w:fill="D9EAF7"/>
+          </w:tcPr>
+          <w:p>
+            <w:r>
+              <w:rPr>
+                <w:b/>
+              </w:rPr>
+              <w:t>Rank</w:t>
+            </w:r>
+          </w:p>
+        </w:tc>
+        <w:tc>
+          <w:tcPr>
+            <w:tcW w:type="dxa" w:w="6264"/>
+            <w:shd w:fill="D9EAF7"/>
+          </w:tcPr>
+          <w:p>
+            <w:r>
+              <w:rPr>
+                <w:b/>
+              </w:rPr>
+              <w:t>Validation configuration</w:t>
+            </w:r>
+          </w:p>
+        </w:tc>
+        <w:tc>
+          <w:tcPr>
+            <w:tcW w:type="dxa" w:w="1296"/>
+            <w:shd w:fill="D9EAF7"/>
+          </w:tcPr>
+          <w:p>
+            <w:r>
+              <w:rPr>
+                <w:b/>
+              </w:rPr>
+              <w:t>Macro-F1</w:t>
+            </w:r>
+          </w:p>
+        </w:tc>
+        <w:tc>
+          <w:tcPr>
+            <w:tcW w:type="dxa" w:w="1296"/>
+            <w:shd w:fill="D9EAF7"/>
+          </w:tcPr>
+          <w:p>
+            <w:r>
+              <w:rPr>
+                <w:b/>
+              </w:rPr>
+              <w:t>Micro-F1</w:t>
+            </w:r>
+          </w:p>
+        </w:tc>
+      </w:tr>
+      <w:tr>
+        <w:tc>
+          <w:tcPr>
+            <w:tcW w:type="dxa" w:w="792"/>
+          </w:tcPr>
+          <w:p>
+            <w:r>
+              <w:t>1</w:t>
+            </w:r>
+          </w:p>
+        </w:tc>
+        <w:tc>
+          <w:tcPr>
+            <w:tcW w:type="dxa" w:w="6264"/>
+          </w:tcPr>
+          <w:p>
+            <w:r>
+              <w:t>bm25 / fulltext / language_stopwords / linear_svc</w:t>
+            </w:r>
+          </w:p>
+        </w:tc>
+        <w:tc>
+          <w:tcPr>
+            <w:tcW w:type="dxa" w:w="1296"/>
+          </w:tcPr>
+          <w:p>
+            <w:r>
+              <w:t>0.7483</w:t>
+            </w:r>
+          </w:p>
+        </w:tc>
+        <w:tc>
+          <w:tcPr>
+            <w:tcW w:type="dxa" w:w="1296"/>
+          </w:tcPr>
+          <w:p>
+            <w:r>
+              <w:t>0.7705</w:t>
+            </w:r>
+          </w:p>
+        </w:tc>
+      </w:tr>
+      <w:tr>
+        <w:tc>
+          <w:tcPr>
+            <w:tcW w:type="dxa" w:w="792"/>
+          </w:tcPr>
+          <w:p>
+            <w:r>
+              <w:t>2</w:t>
+            </w:r>
+          </w:p>
+        </w:tc>
+        <w:tc>
+          <w:tcPr>
+            <w:tcW w:type="dxa" w:w="6264"/>
+          </w:tcPr>
+          <w:p>
+            <w:r>
+              <w:t>bm25 / abstract+keywords+fulltext / language_stopwords / logreg</w:t>
+            </w:r>
+          </w:p>
+        </w:tc>
+        <w:tc>
+          <w:tcPr>
+            <w:tcW w:type="dxa" w:w="1296"/>
+          </w:tcPr>
+          <w:p>
+            <w:r>
+              <w:t>0.7388</w:t>
+            </w:r>
+          </w:p>
+        </w:tc>
+        <w:tc>
+          <w:tcPr>
+            <w:tcW w:type="dxa" w:w="1296"/>
+          </w:tcPr>
+          <w:p>
+            <w:r>
+              <w:t>0.7774</w:t>
+            </w:r>
+          </w:p>
+        </w:tc>
+      </w:tr>
+      <w:tr>
+        <w:tc>
+          <w:tcPr>
+            <w:tcW w:type="dxa" w:w="792"/>
+          </w:tcPr>
+          <w:p>
+            <w:r>
+              <w:t>3</w:t>
+            </w:r>
+          </w:p>
+        </w:tc>
+        <w:tc>
+          <w:tcPr>
+            <w:tcW w:type="dxa" w:w="6264"/>
+          </w:tcPr>
+          <w:p>
+            <w:r>
+              <w:t>tfidf / abstract+fulltext / language_stopwords / linear_svc</w:t>
+            </w:r>
+          </w:p>
+        </w:tc>
+        <w:tc>
+          <w:tcPr>
+            <w:tcW w:type="dxa" w:w="1296"/>
+          </w:tcPr>
+          <w:p>
+            <w:r>
+              <w:t>0.7357</w:t>
+            </w:r>
+          </w:p>
+        </w:tc>
+        <w:tc>
+          <w:tcPr>
+            <w:tcW w:type="dxa" w:w="1296"/>
+          </w:tcPr>
+          <w:p>
+            <w:r>
+              <w:t>0.7571</w:t>
+            </w:r>
+          </w:p>
+        </w:tc>
+      </w:tr>
+      <w:tr>
+        <w:tc>
+          <w:tcPr>
+            <w:tcW w:type="dxa" w:w="792"/>
+          </w:tcPr>
+          <w:p>
+            <w:r>
+              <w:t>4</w:t>
+            </w:r>
+          </w:p>
+        </w:tc>
+        <w:tc>
+          <w:tcPr>
+            <w:tcW w:type="dxa" w:w="6264"/>
+          </w:tcPr>
+          <w:p>
+            <w:r>
+              <w:t>bm25 / fulltext / raw / linear_svc</w:t>
+            </w:r>
+          </w:p>
+        </w:tc>
+        <w:tc>
+          <w:tcPr>
+            <w:tcW w:type="dxa" w:w="1296"/>
+          </w:tcPr>
+          <w:p>
+            <w:r>
+              <w:t>0.7338</w:t>
+            </w:r>
+          </w:p>
+        </w:tc>
+        <w:tc>
+          <w:tcPr>
+            <w:tcW w:type="dxa" w:w="1296"/>
+          </w:tcPr>
+          <w:p>
+            <w:r>
+              <w:t>0.7480</w:t>
+            </w:r>
+          </w:p>
+        </w:tc>
+      </w:tr>
+      <w:tr>
+        <w:tc>
+          <w:tcPr>
+            <w:tcW w:type="dxa" w:w="792"/>
+          </w:tcPr>
+          <w:p>
+            <w:r>
+              <w:t>5</w:t>
+            </w:r>
+          </w:p>
+        </w:tc>
+        <w:tc>
+          <w:tcPr>
+            <w:tcW w:type="dxa" w:w="6264"/>
+          </w:tcPr>
+          <w:p>
+            <w:r>
+              <w:t>bm25 / fulltext / normalized / linear_svc</w:t>
+            </w:r>
+          </w:p>
+        </w:tc>
+        <w:tc>
+          <w:tcPr>
+            <w:tcW w:type="dxa" w:w="1296"/>
+          </w:tcPr>
+          <w:p>
+            <w:r>
+              <w:t>0.7335</w:t>
+            </w:r>
+          </w:p>
+        </w:tc>
+        <w:tc>
+          <w:tcPr>
+            <w:tcW w:type="dxa" w:w="1296"/>
+          </w:tcPr>
+          <w:p>
+            <w:r>
+              <w:t>0.7484</w:t>
+            </w:r>
+          </w:p>
+        </w:tc>
+      </w:tr>
+      <w:tr>
+        <w:tc>
+          <w:tcPr>
+            <w:tcW w:type="dxa" w:w="792"/>
+          </w:tcPr>
+          <w:p>
+            <w:r>
+              <w:t>6</w:t>
+            </w:r>
+          </w:p>
+        </w:tc>
+        <w:tc>
+          <w:tcPr>
+            <w:tcW w:type="dxa" w:w="6264"/>
+          </w:tcPr>
+          <w:p>
+            <w:r>
+              <w:t>tfidf / fulltext / language_stopwords / linear_svc</w:t>
+            </w:r>
+          </w:p>
+        </w:tc>
+        <w:tc>
+          <w:tcPr>
+            <w:tcW w:type="dxa" w:w="1296"/>
+          </w:tcPr>
+          <w:p>
+            <w:r>
+              <w:t>0.7329</w:t>
+            </w:r>
+          </w:p>
+        </w:tc>
+        <w:tc>
+          <w:tcPr>
+            <w:tcW w:type="dxa" w:w="1296"/>
+          </w:tcPr>
+          <w:p>
+            <w:r>
+              <w:t>0.7550</w:t>
+            </w:r>
+          </w:p>
+        </w:tc>
+      </w:tr>
+      <w:tr>
+        <w:tc>
+          <w:tcPr>
+            <w:tcW w:type="dxa" w:w="792"/>
+          </w:tcPr>
+          <w:p>
+            <w:r>
+              <w:t>7</w:t>
+            </w:r>
+          </w:p>
+        </w:tc>
+        <w:tc>
+          <w:tcPr>
+            <w:tcW w:type="dxa" w:w="6264"/>
+          </w:tcPr>
+          <w:p>
+            <w:r>
+              <w:t>tfidf / keywords+fulltext / normalized / linear_svc</w:t>
+            </w:r>
+          </w:p>
+        </w:tc>
+        <w:tc>
+          <w:tcPr>
+            <w:tcW w:type="dxa" w:w="1296"/>
+          </w:tcPr>
+          <w:p>
+            <w:r>
+              <w:t>0.7316</w:t>
+            </w:r>
+          </w:p>
+        </w:tc>
+        <w:tc>
+          <w:tcPr>
+            <w:tcW w:type="dxa" w:w="1296"/>
+          </w:tcPr>
+          <w:p>
+            <w:r>
+              <w:t>0.7533</w:t>
+            </w:r>
+          </w:p>
+        </w:tc>
+      </w:tr>
+      <w:tr>
+        <w:tc>
+          <w:tcPr>
+            <w:tcW w:type="dxa" w:w="792"/>
+          </w:tcPr>
+          <w:p>
+            <w:r>
+              <w:t>8</w:t>
+            </w:r>
+          </w:p>
+        </w:tc>
+        <w:tc>
+          <w:tcPr>
+            <w:tcW w:type="dxa" w:w="6264"/>
+          </w:tcPr>
+          <w:p>
+            <w:r>
+              <w:t>tfidf / abstract+keywords+fulltext / language_stopwords / linear_svc</w:t>
+            </w:r>
+          </w:p>
+        </w:tc>
+        <w:tc>
+          <w:tcPr>
+            <w:tcW w:type="dxa" w:w="1296"/>
+          </w:tcPr>
+          <w:p>
+            <w:r>
+              <w:t>0.7315</w:t>
+            </w:r>
+          </w:p>
+        </w:tc>
+        <w:tc>
+          <w:tcPr>
+            <w:tcW w:type="dxa" w:w="1296"/>
+          </w:tcPr>
+          <w:p>
+            <w:r>
+              <w:t>0.7559</w:t>
+            </w:r>
+          </w:p>
+        </w:tc>
+      </w:tr>
+      <w:tr>
+        <w:tc>
+          <w:tcPr>
+            <w:tcW w:type="dxa" w:w="792"/>
+          </w:tcPr>
+          <w:p>
+            <w:r>
+              <w:t>9</w:t>
+            </w:r>
+          </w:p>
+        </w:tc>
+        <w:tc>
+          <w:tcPr>
+            <w:tcW w:type="dxa" w:w="6264"/>
+          </w:tcPr>
+          <w:p>
+            <w:r>
+              <w:t>bm25 / abstract+fulltext / language_stopwords / logreg</w:t>
+            </w:r>
+          </w:p>
+        </w:tc>
+        <w:tc>
+          <w:tcPr>
+            <w:tcW w:type="dxa" w:w="1296"/>
+          </w:tcPr>
+          <w:p>
+            <w:r>
+              <w:t>0.7312</w:t>
+            </w:r>
+          </w:p>
+        </w:tc>
+        <w:tc>
+          <w:tcPr>
+            <w:tcW w:type="dxa" w:w="1296"/>
+          </w:tcPr>
+          <w:p>
+            <w:r>
+              <w:t>0.7752</w:t>
+            </w:r>
+          </w:p>
+        </w:tc>
+      </w:tr>
+      <w:tr>
+        <w:tc>
+          <w:tcPr>
+            <w:tcW w:type="dxa" w:w="792"/>
+          </w:tcPr>
+          <w:p>
+            <w:r>
+              <w:t>10</w:t>
+            </w:r>
+          </w:p>
+        </w:tc>
+        <w:tc>
+          <w:tcPr>
+            <w:tcW w:type="dxa" w:w="6264"/>
+          </w:tcPr>
+          <w:p>
+            <w:r>
+              <w:t>tfidf / abstract+keywords+fulltext / raw / linear_svc</w:t>
+            </w:r>
+          </w:p>
+        </w:tc>
+        <w:tc>
+          <w:tcPr>
+            <w:tcW w:type="dxa" w:w="1296"/>
+          </w:tcPr>
+          <w:p>
+            <w:r>
+              <w:t>0.7296</w:t>
+            </w:r>
+          </w:p>
+        </w:tc>
+        <w:tc>
+          <w:tcPr>
+            <w:tcW w:type="dxa" w:w="1296"/>
+          </w:tcPr>
+          <w:p>
+            <w:r>
+              <w:t>0.7509</w:t>
+            </w:r>
+          </w:p>
+        </w:tc>
+      </w:tr>
+      <w:tr>
+        <w:tc>
+          <w:tcPr>
+            <w:tcW w:type="dxa" w:w="792"/>
+          </w:tcPr>
+          <w:p>
+            <w:r>
+              <w:t>11</w:t>
+            </w:r>
+          </w:p>
+        </w:tc>
+        <w:tc>
+          <w:tcPr>
+            <w:tcW w:type="dxa" w:w="6264"/>
+          </w:tcPr>
+          <w:p>
+            <w:r>
+              <w:t>bm25 / keywords+fulltext / language_stopwords / logreg</w:t>
+            </w:r>
+          </w:p>
+        </w:tc>
+        <w:tc>
+          <w:tcPr>
+            <w:tcW w:type="dxa" w:w="1296"/>
+          </w:tcPr>
+          <w:p>
+            <w:r>
+              <w:t>0.7295</w:t>
+            </w:r>
+          </w:p>
+        </w:tc>
+        <w:tc>
+          <w:tcPr>
+            <w:tcW w:type="dxa" w:w="1296"/>
+          </w:tcPr>
+          <w:p>
+            <w:r>
+              <w:t>0.7704</w:t>
+            </w:r>
+          </w:p>
+        </w:tc>
+      </w:tr>
+      <w:tr>
+        <w:tc>
+          <w:tcPr>
+            <w:tcW w:type="dxa" w:w="792"/>
+          </w:tcPr>
+          <w:p>
+            <w:r>
+              <w:t>12</w:t>
+            </w:r>
+          </w:p>
+        </w:tc>
+        <w:tc>
+          <w:tcPr>
+            <w:tcW w:type="dxa" w:w="6264"/>
+          </w:tcPr>
+          <w:p>
+            <w:r>
+              <w:t>tfidf / abstract+keywords+fulltext / normalized / linear_svc</w:t>
+            </w:r>
+          </w:p>
+        </w:tc>
+        <w:tc>
+          <w:tcPr>
+            <w:tcW w:type="dxa" w:w="1296"/>
+          </w:tcPr>
+          <w:p>
+            <w:r>
+              <w:t>0.7294</w:t>
+            </w:r>
+          </w:p>
+        </w:tc>
+        <w:tc>
+          <w:tcPr>
+            <w:tcW w:type="dxa" w:w="1296"/>
+          </w:tcPr>
+          <w:p>
+            <w:r>
+              <w:t>0.7512</w:t>
+            </w:r>
+          </w:p>
+        </w:tc>
+      </w:tr>
+      <w:tr>
+        <w:tc>
+          <w:tcPr>
+            <w:tcW w:type="dxa" w:w="792"/>
+          </w:tcPr>
+          <w:p>
+            <w:r>
+              <w:t>13</w:t>
+            </w:r>
+          </w:p>
+        </w:tc>
+        <w:tc>
+          <w:tcPr>
+            <w:tcW w:type="dxa" w:w="6264"/>
+          </w:tcPr>
+          <w:p>
+            <w:r>
+              <w:t>tfidf / keywords+fulltext / raw / linear_svc</w:t>
+            </w:r>
+          </w:p>
+        </w:tc>
+        <w:tc>
+          <w:tcPr>
+            <w:tcW w:type="dxa" w:w="1296"/>
+          </w:tcPr>
+          <w:p>
+            <w:r>
+              <w:t>0.7294</w:t>
+            </w:r>
+          </w:p>
+        </w:tc>
+        <w:tc>
+          <w:tcPr>
+            <w:tcW w:type="dxa" w:w="1296"/>
+          </w:tcPr>
+          <w:p>
+            <w:r>
+              <w:t>0.7517</w:t>
+            </w:r>
+          </w:p>
+        </w:tc>
+      </w:tr>
+      <w:tr>
+        <w:tc>
+          <w:tcPr>
+            <w:tcW w:type="dxa" w:w="792"/>
+          </w:tcPr>
+          <w:p>
+            <w:r>
+              <w:t>14</w:t>
+            </w:r>
+          </w:p>
+        </w:tc>
+        <w:tc>
+          <w:tcPr>
+            <w:tcW w:type="dxa" w:w="6264"/>
+          </w:tcPr>
+          <w:p>
+            <w:r>
+              <w:t>bm25 / abstract+keywords+fulltext / language_stopwords / linear_svc</w:t>
+            </w:r>
+          </w:p>
+        </w:tc>
+        <w:tc>
+          <w:tcPr>
+            <w:tcW w:type="dxa" w:w="1296"/>
+          </w:tcPr>
+          <w:p>
+            <w:r>
+              <w:t>0.7291</w:t>
+            </w:r>
+          </w:p>
+        </w:tc>
+        <w:tc>
+          <w:tcPr>
+            <w:tcW w:type="dxa" w:w="1296"/>
+          </w:tcPr>
+          <w:p>
+            <w:r>
+              <w:t>0.7612</w:t>
+            </w:r>
+          </w:p>
+        </w:tc>
+      </w:tr>
+      <w:tr>
+        <w:tc>
+          <w:tcPr>
+            <w:tcW w:type="dxa" w:w="792"/>
+          </w:tcPr>
+          <w:p>
+            <w:r>
+              <w:t>15</w:t>
+            </w:r>
+          </w:p>
+        </w:tc>
+        <w:tc>
+          <w:tcPr>
+            <w:tcW w:type="dxa" w:w="6264"/>
+          </w:tcPr>
+          <w:p>
+            <w:r>
+              <w:t>tfidf / keywords+fulltext / language_stopwords / linear_svc</w:t>
+            </w:r>
+          </w:p>
+        </w:tc>
+        <w:tc>
+          <w:tcPr>
+            <w:tcW w:type="dxa" w:w="1296"/>
+          </w:tcPr>
+          <w:p>
+            <w:r>
+              <w:t>0.7291</w:t>
+            </w:r>
+          </w:p>
+        </w:tc>
+        <w:tc>
+          <w:tcPr>
+            <w:tcW w:type="dxa" w:w="1296"/>
+          </w:tcPr>
+          <w:p>
+            <w:r>
+              <w:t>0.7543</w:t>
+            </w:r>
+          </w:p>
+        </w:tc>
+      </w:tr>
+    </w:tbl>
+    <w:p/>
+    <w:p>
+      <w:r>
+        <w:t>Table S6 reports the 15 highest Macro-F1 configurations. The complete 233-row validation grid is distributed as runs/v3_main/results_validation_grid.csv.</w:t>
+      </w:r>
+    </w:p>
+    <w:tbl>
+      <w:tblPr>
+        <w:tblStyle w:val="LightShading-Accent1"/>
+        <w:tblW w:type="auto" w:w="0"/>
+        <w:tblLook w:firstColumn="1" w:firstRow="1" w:lastColumn="0" w:lastRow="0" w:noHBand="0" w:noVBand="1" w:val="04A0"/>
+      </w:tblPr>
+      <w:tblGrid>
         <w:gridCol w:w="2033"/>
         <w:gridCol w:w="2033"/>
         <w:gridCol w:w="2033"/>
@@ -1265,6 +1972,319 @@
         <w:t>S6. Convergence audit and final held-out metrics</w:t>
       </w:r>
     </w:p>
+    <w:tbl>
+      <w:tblPr>
+        <w:tblStyle w:val="LightShading-Accent1"/>
+        <w:tblW w:type="auto" w:w="0"/>
+        <w:tblLook w:firstColumn="1" w:firstRow="1" w:lastColumn="0" w:lastRow="0" w:noHBand="0" w:noVBand="1" w:val="04A0"/>
+      </w:tblPr>
+      <w:tblGrid>
+        <w:gridCol w:w="3389"/>
+        <w:gridCol w:w="3389"/>
+        <w:gridCol w:w="3389"/>
+      </w:tblGrid>
+      <w:tr>
+        <w:tc>
+          <w:tcPr>
+            <w:tcW w:type="dxa" w:w="6768"/>
+            <w:shd w:fill="D9EAF7"/>
+          </w:tcPr>
+          <w:p>
+            <w:r>
+              <w:rPr>
+                <w:b/>
+              </w:rPr>
+              <w:t>Configuration</w:t>
+            </w:r>
+          </w:p>
+        </w:tc>
+        <w:tc>
+          <w:tcPr>
+            <w:tcW w:type="dxa" w:w="1440"/>
+            <w:shd w:fill="D9EAF7"/>
+          </w:tcPr>
+          <w:p>
+            <w:r>
+              <w:rPr>
+                <w:b/>
+              </w:rPr>
+              <w:t>Macro-F1</w:t>
+            </w:r>
+          </w:p>
+        </w:tc>
+        <w:tc>
+          <w:tcPr>
+            <w:tcW w:type="dxa" w:w="1440"/>
+            <w:shd w:fill="D9EAF7"/>
+          </w:tcPr>
+          <w:p>
+            <w:r>
+              <w:rPr>
+                <w:b/>
+              </w:rPr>
+              <w:t>Micro-F1</w:t>
+            </w:r>
+          </w:p>
+        </w:tc>
+      </w:tr>
+      <w:tr>
+        <w:tc>
+          <w:tcPr>
+            <w:tcW w:type="dxa" w:w="6768"/>
+          </w:tcPr>
+          <w:p>
+            <w:r>
+              <w:t>bm25 / fulltext / language_stopwords / linear_svc_c05_tol5e4</w:t>
+            </w:r>
+          </w:p>
+        </w:tc>
+        <w:tc>
+          <w:tcPr>
+            <w:tcW w:type="dxa" w:w="1440"/>
+          </w:tcPr>
+          <w:p>
+            <w:r>
+              <w:t>0.7497</w:t>
+            </w:r>
+          </w:p>
+        </w:tc>
+        <w:tc>
+          <w:tcPr>
+            <w:tcW w:type="dxa" w:w="1440"/>
+          </w:tcPr>
+          <w:p>
+            <w:r>
+              <w:t>0.7732</w:t>
+            </w:r>
+          </w:p>
+        </w:tc>
+      </w:tr>
+      <w:tr>
+        <w:tc>
+          <w:tcPr>
+            <w:tcW w:type="dxa" w:w="6768"/>
+          </w:tcPr>
+          <w:p>
+            <w:r>
+              <w:t>bm25 / fulltext / language_stopwords / linear_svc_c05_tol1e4</w:t>
+            </w:r>
+          </w:p>
+        </w:tc>
+        <w:tc>
+          <w:tcPr>
+            <w:tcW w:type="dxa" w:w="1440"/>
+          </w:tcPr>
+          <w:p>
+            <w:r>
+              <w:t>0.7497</w:t>
+            </w:r>
+          </w:p>
+        </w:tc>
+        <w:tc>
+          <w:tcPr>
+            <w:tcW w:type="dxa" w:w="1440"/>
+          </w:tcPr>
+          <w:p>
+            <w:r>
+              <w:t>0.7732</w:t>
+            </w:r>
+          </w:p>
+        </w:tc>
+      </w:tr>
+      <w:tr>
+        <w:tc>
+          <w:tcPr>
+            <w:tcW w:type="dxa" w:w="6768"/>
+          </w:tcPr>
+          <w:p>
+            <w:r>
+              <w:t>bm25 / fulltext / language_stopwords / linear_svc_c1_tol5e4</w:t>
+            </w:r>
+          </w:p>
+        </w:tc>
+        <w:tc>
+          <w:tcPr>
+            <w:tcW w:type="dxa" w:w="1440"/>
+          </w:tcPr>
+          <w:p>
+            <w:r>
+              <w:t>0.7483</w:t>
+            </w:r>
+          </w:p>
+        </w:tc>
+        <w:tc>
+          <w:tcPr>
+            <w:tcW w:type="dxa" w:w="1440"/>
+          </w:tcPr>
+          <w:p>
+            <w:r>
+              <w:t>0.7705</w:t>
+            </w:r>
+          </w:p>
+        </w:tc>
+      </w:tr>
+      <w:tr>
+        <w:tc>
+          <w:tcPr>
+            <w:tcW w:type="dxa" w:w="6768"/>
+          </w:tcPr>
+          <w:p>
+            <w:r>
+              <w:t>bm25 / fulltext / language_stopwords / linear_svc_c1_tol1e4</w:t>
+            </w:r>
+          </w:p>
+        </w:tc>
+        <w:tc>
+          <w:tcPr>
+            <w:tcW w:type="dxa" w:w="1440"/>
+          </w:tcPr>
+          <w:p>
+            <w:r>
+              <w:t>0.7483</w:t>
+            </w:r>
+          </w:p>
+        </w:tc>
+        <w:tc>
+          <w:tcPr>
+            <w:tcW w:type="dxa" w:w="1440"/>
+          </w:tcPr>
+          <w:p>
+            <w:r>
+              <w:t>0.7705</w:t>
+            </w:r>
+          </w:p>
+        </w:tc>
+      </w:tr>
+      <w:tr>
+        <w:tc>
+          <w:tcPr>
+            <w:tcW w:type="dxa" w:w="6768"/>
+          </w:tcPr>
+          <w:p>
+            <w:r>
+              <w:t>tfidf / fulltext / language_stopwords / linear_svc_c1_tol1e4</w:t>
+            </w:r>
+          </w:p>
+        </w:tc>
+        <w:tc>
+          <w:tcPr>
+            <w:tcW w:type="dxa" w:w="1440"/>
+          </w:tcPr>
+          <w:p>
+            <w:r>
+              <w:t>0.7329</w:t>
+            </w:r>
+          </w:p>
+        </w:tc>
+        <w:tc>
+          <w:tcPr>
+            <w:tcW w:type="dxa" w:w="1440"/>
+          </w:tcPr>
+          <w:p>
+            <w:r>
+              <w:t>0.7550</w:t>
+            </w:r>
+          </w:p>
+        </w:tc>
+      </w:tr>
+      <w:tr>
+        <w:tc>
+          <w:tcPr>
+            <w:tcW w:type="dxa" w:w="6768"/>
+          </w:tcPr>
+          <w:p>
+            <w:r>
+              <w:t>tfidf / fulltext / language_stopwords / linear_svc_c1_tol5e4</w:t>
+            </w:r>
+          </w:p>
+        </w:tc>
+        <w:tc>
+          <w:tcPr>
+            <w:tcW w:type="dxa" w:w="1440"/>
+          </w:tcPr>
+          <w:p>
+            <w:r>
+              <w:t>0.7329</w:t>
+            </w:r>
+          </w:p>
+        </w:tc>
+        <w:tc>
+          <w:tcPr>
+            <w:tcW w:type="dxa" w:w="1440"/>
+          </w:tcPr>
+          <w:p>
+            <w:r>
+              <w:t>0.7550</w:t>
+            </w:r>
+          </w:p>
+        </w:tc>
+      </w:tr>
+      <w:tr>
+        <w:tc>
+          <w:tcPr>
+            <w:tcW w:type="dxa" w:w="6768"/>
+          </w:tcPr>
+          <w:p>
+            <w:r>
+              <w:t>tfidf / fulltext / language_stopwords / linear_svc_c05_tol1e4</w:t>
+            </w:r>
+          </w:p>
+        </w:tc>
+        <w:tc>
+          <w:tcPr>
+            <w:tcW w:type="dxa" w:w="1440"/>
+          </w:tcPr>
+          <w:p>
+            <w:r>
+              <w:t>0.7307</w:t>
+            </w:r>
+          </w:p>
+        </w:tc>
+        <w:tc>
+          <w:tcPr>
+            <w:tcW w:type="dxa" w:w="1440"/>
+          </w:tcPr>
+          <w:p>
+            <w:r>
+              <w:t>0.7554</w:t>
+            </w:r>
+          </w:p>
+        </w:tc>
+      </w:tr>
+      <w:tr>
+        <w:tc>
+          <w:tcPr>
+            <w:tcW w:type="dxa" w:w="6768"/>
+          </w:tcPr>
+          <w:p>
+            <w:r>
+              <w:t>tfidf / fulltext / language_stopwords / linear_svc_c05_tol5e4</w:t>
+            </w:r>
+          </w:p>
+        </w:tc>
+        <w:tc>
+          <w:tcPr>
+            <w:tcW w:type="dxa" w:w="1440"/>
+          </w:tcPr>
+          <w:p>
+            <w:r>
+              <w:t>0.7307</w:t>
+            </w:r>
+          </w:p>
+        </w:tc>
+        <w:tc>
+          <w:tcPr>
+            <w:tcW w:type="dxa" w:w="1440"/>
+          </w:tcPr>
+          <w:p>
+            <w:r>
+              <w:t>0.7554</w:t>
+            </w:r>
+          </w:p>
+        </w:tc>
+      </w:tr>
+    </w:tbl>
+    <w:p/>
     <w:tbl>
       <w:tblPr>
         <w:tblStyle w:val="LightShading-Accent1"/>
@@ -1567,6 +2587,717 @@
         <w:t>Figure S3. Final held-out metric overview.</w:t>
       </w:r>
     </w:p>
+    <w:tbl>
+      <w:tblPr>
+        <w:tblStyle w:val="LightShading-Accent1"/>
+        <w:tblW w:type="auto" w:w="0"/>
+        <w:tblLook w:firstColumn="1" w:firstRow="1" w:lastColumn="0" w:lastRow="0" w:noHBand="0" w:noVBand="1" w:val="04A0"/>
+      </w:tblPr>
+      <w:tblGrid>
+        <w:gridCol w:w="2033"/>
+        <w:gridCol w:w="2033"/>
+        <w:gridCol w:w="2033"/>
+        <w:gridCol w:w="2033"/>
+        <w:gridCol w:w="2033"/>
+      </w:tblGrid>
+      <w:tr>
+        <w:tc>
+          <w:tcPr>
+            <w:tcW w:type="dxa" w:w="3312"/>
+            <w:shd w:fill="D9EAF7"/>
+          </w:tcPr>
+          <w:p>
+            <w:r>
+              <w:rPr>
+                <w:b/>
+              </w:rPr>
+              <w:t>Comparison</w:t>
+            </w:r>
+          </w:p>
+        </w:tc>
+        <w:tc>
+          <w:tcPr>
+            <w:tcW w:type="dxa" w:w="1296"/>
+            <w:shd w:fill="D9EAF7"/>
+          </w:tcPr>
+          <w:p>
+            <w:r>
+              <w:rPr>
+                <w:b/>
+              </w:rPr>
+              <w:t>Metric</w:t>
+            </w:r>
+          </w:p>
+        </w:tc>
+        <w:tc>
+          <w:tcPr>
+            <w:tcW w:type="dxa" w:w="1584"/>
+            <w:shd w:fill="D9EAF7"/>
+          </w:tcPr>
+          <w:p>
+            <w:r>
+              <w:rPr>
+                <w:b/>
+              </w:rPr>
+              <w:t>Difference</w:t>
+            </w:r>
+          </w:p>
+        </w:tc>
+        <w:tc>
+          <w:tcPr>
+            <w:tcW w:type="dxa" w:w="2304"/>
+            <w:shd w:fill="D9EAF7"/>
+          </w:tcPr>
+          <w:p>
+            <w:r>
+              <w:rPr>
+                <w:b/>
+              </w:rPr>
+              <w:t>95% CI</w:t>
+            </w:r>
+          </w:p>
+        </w:tc>
+        <w:tc>
+          <w:tcPr>
+            <w:tcW w:type="dxa" w:w="1008"/>
+            <w:shd w:fill="D9EAF7"/>
+          </w:tcPr>
+          <w:p>
+            <w:r>
+              <w:rPr>
+                <w:b/>
+              </w:rPr>
+              <w:t>P(candidate &gt; BM25)</w:t>
+            </w:r>
+          </w:p>
+        </w:tc>
+      </w:tr>
+      <w:tr>
+        <w:tc>
+          <w:tcPr>
+            <w:tcW w:type="dxa" w:w="3312"/>
+          </w:tcPr>
+          <w:p>
+            <w:r>
+              <w:t>tfidf minus final BM25</w:t>
+            </w:r>
+          </w:p>
+        </w:tc>
+        <w:tc>
+          <w:tcPr>
+            <w:tcW w:type="dxa" w:w="1296"/>
+          </w:tcPr>
+          <w:p>
+            <w:r>
+              <w:t>f1_macro</w:t>
+            </w:r>
+          </w:p>
+        </w:tc>
+        <w:tc>
+          <w:tcPr>
+            <w:tcW w:type="dxa" w:w="1584"/>
+          </w:tcPr>
+          <w:p>
+            <w:r>
+              <w:t>-0.0184</w:t>
+            </w:r>
+          </w:p>
+        </w:tc>
+        <w:tc>
+          <w:tcPr>
+            <w:tcW w:type="dxa" w:w="2304"/>
+          </w:tcPr>
+          <w:p>
+            <w:r>
+              <w:t>[-0.0299, -0.0068]</w:t>
+            </w:r>
+          </w:p>
+        </w:tc>
+        <w:tc>
+          <w:tcPr>
+            <w:tcW w:type="dxa" w:w="1008"/>
+          </w:tcPr>
+          <w:p>
+            <w:r>
+              <w:t>0.0000</w:t>
+            </w:r>
+          </w:p>
+        </w:tc>
+      </w:tr>
+      <w:tr>
+        <w:tc>
+          <w:tcPr>
+            <w:tcW w:type="dxa" w:w="3312"/>
+          </w:tcPr>
+          <w:p>
+            <w:r>
+              <w:t>tfidf minus final BM25</w:t>
+            </w:r>
+          </w:p>
+        </w:tc>
+        <w:tc>
+          <w:tcPr>
+            <w:tcW w:type="dxa" w:w="1296"/>
+          </w:tcPr>
+          <w:p>
+            <w:r>
+              <w:t>f1_micro</w:t>
+            </w:r>
+          </w:p>
+        </w:tc>
+        <w:tc>
+          <w:tcPr>
+            <w:tcW w:type="dxa" w:w="1584"/>
+          </w:tcPr>
+          <w:p>
+            <w:r>
+              <w:t>-0.0156</w:t>
+            </w:r>
+          </w:p>
+        </w:tc>
+        <w:tc>
+          <w:tcPr>
+            <w:tcW w:type="dxa" w:w="2304"/>
+          </w:tcPr>
+          <w:p>
+            <w:r>
+              <w:t>[-0.0243, -0.0072]</w:t>
+            </w:r>
+          </w:p>
+        </w:tc>
+        <w:tc>
+          <w:tcPr>
+            <w:tcW w:type="dxa" w:w="1008"/>
+          </w:tcPr>
+          <w:p>
+            <w:r>
+              <w:t>0.0010</w:t>
+            </w:r>
+          </w:p>
+        </w:tc>
+      </w:tr>
+      <w:tr>
+        <w:tc>
+          <w:tcPr>
+            <w:tcW w:type="dxa" w:w="3312"/>
+          </w:tcPr>
+          <w:p>
+            <w:r>
+              <w:t>labse_finetuned minus final BM25</w:t>
+            </w:r>
+          </w:p>
+        </w:tc>
+        <w:tc>
+          <w:tcPr>
+            <w:tcW w:type="dxa" w:w="1296"/>
+          </w:tcPr>
+          <w:p>
+            <w:r>
+              <w:t>f1_macro</w:t>
+            </w:r>
+          </w:p>
+        </w:tc>
+        <w:tc>
+          <w:tcPr>
+            <w:tcW w:type="dxa" w:w="1584"/>
+          </w:tcPr>
+          <w:p>
+            <w:r>
+              <w:t>-0.0453</w:t>
+            </w:r>
+          </w:p>
+        </w:tc>
+        <w:tc>
+          <w:tcPr>
+            <w:tcW w:type="dxa" w:w="2304"/>
+          </w:tcPr>
+          <w:p>
+            <w:r>
+              <w:t>[-0.0587, -0.0311]</w:t>
+            </w:r>
+          </w:p>
+        </w:tc>
+        <w:tc>
+          <w:tcPr>
+            <w:tcW w:type="dxa" w:w="1008"/>
+          </w:tcPr>
+          <w:p>
+            <w:r>
+              <w:t>0.0000</w:t>
+            </w:r>
+          </w:p>
+        </w:tc>
+      </w:tr>
+      <w:tr>
+        <w:tc>
+          <w:tcPr>
+            <w:tcW w:type="dxa" w:w="3312"/>
+          </w:tcPr>
+          <w:p>
+            <w:r>
+              <w:t>labse_finetuned minus final BM25</w:t>
+            </w:r>
+          </w:p>
+        </w:tc>
+        <w:tc>
+          <w:tcPr>
+            <w:tcW w:type="dxa" w:w="1296"/>
+          </w:tcPr>
+          <w:p>
+            <w:r>
+              <w:t>f1_micro</w:t>
+            </w:r>
+          </w:p>
+        </w:tc>
+        <w:tc>
+          <w:tcPr>
+            <w:tcW w:type="dxa" w:w="1584"/>
+          </w:tcPr>
+          <w:p>
+            <w:r>
+              <w:t>-0.0406</w:t>
+            </w:r>
+          </w:p>
+        </w:tc>
+        <w:tc>
+          <w:tcPr>
+            <w:tcW w:type="dxa" w:w="2304"/>
+          </w:tcPr>
+          <w:p>
+            <w:r>
+              <w:t>[-0.0508, -0.0303]</w:t>
+            </w:r>
+          </w:p>
+        </w:tc>
+        <w:tc>
+          <w:tcPr>
+            <w:tcW w:type="dxa" w:w="1008"/>
+          </w:tcPr>
+          <w:p>
+            <w:r>
+              <w:t>0.0000</w:t>
+            </w:r>
+          </w:p>
+        </w:tc>
+      </w:tr>
+      <w:tr>
+        <w:tc>
+          <w:tcPr>
+            <w:tcW w:type="dxa" w:w="3312"/>
+          </w:tcPr>
+          <w:p>
+            <w:r>
+              <w:t>bow minus final BM25</w:t>
+            </w:r>
+          </w:p>
+        </w:tc>
+        <w:tc>
+          <w:tcPr>
+            <w:tcW w:type="dxa" w:w="1296"/>
+          </w:tcPr>
+          <w:p>
+            <w:r>
+              <w:t>f1_macro</w:t>
+            </w:r>
+          </w:p>
+        </w:tc>
+        <w:tc>
+          <w:tcPr>
+            <w:tcW w:type="dxa" w:w="1584"/>
+          </w:tcPr>
+          <w:p>
+            <w:r>
+              <w:t>-0.0741</w:t>
+            </w:r>
+          </w:p>
+        </w:tc>
+        <w:tc>
+          <w:tcPr>
+            <w:tcW w:type="dxa" w:w="2304"/>
+          </w:tcPr>
+          <w:p>
+            <w:r>
+              <w:t>[-0.0896, -0.0590]</w:t>
+            </w:r>
+          </w:p>
+        </w:tc>
+        <w:tc>
+          <w:tcPr>
+            <w:tcW w:type="dxa" w:w="1008"/>
+          </w:tcPr>
+          <w:p>
+            <w:r>
+              <w:t>0.0000</w:t>
+            </w:r>
+          </w:p>
+        </w:tc>
+      </w:tr>
+      <w:tr>
+        <w:tc>
+          <w:tcPr>
+            <w:tcW w:type="dxa" w:w="3312"/>
+          </w:tcPr>
+          <w:p>
+            <w:r>
+              <w:t>bow minus final BM25</w:t>
+            </w:r>
+          </w:p>
+        </w:tc>
+        <w:tc>
+          <w:tcPr>
+            <w:tcW w:type="dxa" w:w="1296"/>
+          </w:tcPr>
+          <w:p>
+            <w:r>
+              <w:t>f1_micro</w:t>
+            </w:r>
+          </w:p>
+        </w:tc>
+        <w:tc>
+          <w:tcPr>
+            <w:tcW w:type="dxa" w:w="1584"/>
+          </w:tcPr>
+          <w:p>
+            <w:r>
+              <w:t>-0.0549</w:t>
+            </w:r>
+          </w:p>
+        </w:tc>
+        <w:tc>
+          <w:tcPr>
+            <w:tcW w:type="dxa" w:w="2304"/>
+          </w:tcPr>
+          <w:p>
+            <w:r>
+              <w:t>[-0.0662, -0.0441]</w:t>
+            </w:r>
+          </w:p>
+        </w:tc>
+        <w:tc>
+          <w:tcPr>
+            <w:tcW w:type="dxa" w:w="1008"/>
+          </w:tcPr>
+          <w:p>
+            <w:r>
+              <w:t>0.0000</w:t>
+            </w:r>
+          </w:p>
+        </w:tc>
+      </w:tr>
+      <w:tr>
+        <w:tc>
+          <w:tcPr>
+            <w:tcW w:type="dxa" w:w="3312"/>
+          </w:tcPr>
+          <w:p>
+            <w:r>
+              <w:t>sbert_finetuned minus final BM25</w:t>
+            </w:r>
+          </w:p>
+        </w:tc>
+        <w:tc>
+          <w:tcPr>
+            <w:tcW w:type="dxa" w:w="1296"/>
+          </w:tcPr>
+          <w:p>
+            <w:r>
+              <w:t>f1_macro</w:t>
+            </w:r>
+          </w:p>
+        </w:tc>
+        <w:tc>
+          <w:tcPr>
+            <w:tcW w:type="dxa" w:w="1584"/>
+          </w:tcPr>
+          <w:p>
+            <w:r>
+              <w:t>-0.0928</w:t>
+            </w:r>
+          </w:p>
+        </w:tc>
+        <w:tc>
+          <w:tcPr>
+            <w:tcW w:type="dxa" w:w="2304"/>
+          </w:tcPr>
+          <w:p>
+            <w:r>
+              <w:t>[-0.1070, -0.0779]</w:t>
+            </w:r>
+          </w:p>
+        </w:tc>
+        <w:tc>
+          <w:tcPr>
+            <w:tcW w:type="dxa" w:w="1008"/>
+          </w:tcPr>
+          <w:p>
+            <w:r>
+              <w:t>0.0000</w:t>
+            </w:r>
+          </w:p>
+        </w:tc>
+      </w:tr>
+      <w:tr>
+        <w:tc>
+          <w:tcPr>
+            <w:tcW w:type="dxa" w:w="3312"/>
+          </w:tcPr>
+          <w:p>
+            <w:r>
+              <w:t>sbert_finetuned minus final BM25</w:t>
+            </w:r>
+          </w:p>
+        </w:tc>
+        <w:tc>
+          <w:tcPr>
+            <w:tcW w:type="dxa" w:w="1296"/>
+          </w:tcPr>
+          <w:p>
+            <w:r>
+              <w:t>f1_micro</w:t>
+            </w:r>
+          </w:p>
+        </w:tc>
+        <w:tc>
+          <w:tcPr>
+            <w:tcW w:type="dxa" w:w="1584"/>
+          </w:tcPr>
+          <w:p>
+            <w:r>
+              <w:t>-0.0939</w:t>
+            </w:r>
+          </w:p>
+        </w:tc>
+        <w:tc>
+          <w:tcPr>
+            <w:tcW w:type="dxa" w:w="2304"/>
+          </w:tcPr>
+          <w:p>
+            <w:r>
+              <w:t>[-0.1055, -0.0822]</w:t>
+            </w:r>
+          </w:p>
+        </w:tc>
+        <w:tc>
+          <w:tcPr>
+            <w:tcW w:type="dxa" w:w="1008"/>
+          </w:tcPr>
+          <w:p>
+            <w:r>
+              <w:t>0.0000</w:t>
+            </w:r>
+          </w:p>
+        </w:tc>
+      </w:tr>
+      <w:tr>
+        <w:tc>
+          <w:tcPr>
+            <w:tcW w:type="dxa" w:w="3312"/>
+          </w:tcPr>
+          <w:p>
+            <w:r>
+              <w:t>sbert_frozen minus final BM25</w:t>
+            </w:r>
+          </w:p>
+        </w:tc>
+        <w:tc>
+          <w:tcPr>
+            <w:tcW w:type="dxa" w:w="1296"/>
+          </w:tcPr>
+          <w:p>
+            <w:r>
+              <w:t>f1_macro</w:t>
+            </w:r>
+          </w:p>
+        </w:tc>
+        <w:tc>
+          <w:tcPr>
+            <w:tcW w:type="dxa" w:w="1584"/>
+          </w:tcPr>
+          <w:p>
+            <w:r>
+              <w:t>-0.1311</w:t>
+            </w:r>
+          </w:p>
+        </w:tc>
+        <w:tc>
+          <w:tcPr>
+            <w:tcW w:type="dxa" w:w="2304"/>
+          </w:tcPr>
+          <w:p>
+            <w:r>
+              <w:t>[-0.1458, -0.1163]</w:t>
+            </w:r>
+          </w:p>
+        </w:tc>
+        <w:tc>
+          <w:tcPr>
+            <w:tcW w:type="dxa" w:w="1008"/>
+          </w:tcPr>
+          <w:p>
+            <w:r>
+              <w:t>0.0000</w:t>
+            </w:r>
+          </w:p>
+        </w:tc>
+      </w:tr>
+      <w:tr>
+        <w:tc>
+          <w:tcPr>
+            <w:tcW w:type="dxa" w:w="3312"/>
+          </w:tcPr>
+          <w:p>
+            <w:r>
+              <w:t>sbert_frozen minus final BM25</w:t>
+            </w:r>
+          </w:p>
+        </w:tc>
+        <w:tc>
+          <w:tcPr>
+            <w:tcW w:type="dxa" w:w="1296"/>
+          </w:tcPr>
+          <w:p>
+            <w:r>
+              <w:t>f1_micro</w:t>
+            </w:r>
+          </w:p>
+        </w:tc>
+        <w:tc>
+          <w:tcPr>
+            <w:tcW w:type="dxa" w:w="1584"/>
+          </w:tcPr>
+          <w:p>
+            <w:r>
+              <w:t>-0.1288</w:t>
+            </w:r>
+          </w:p>
+        </w:tc>
+        <w:tc>
+          <w:tcPr>
+            <w:tcW w:type="dxa" w:w="2304"/>
+          </w:tcPr>
+          <w:p>
+            <w:r>
+              <w:t>[-0.1398, -0.1175]</w:t>
+            </w:r>
+          </w:p>
+        </w:tc>
+        <w:tc>
+          <w:tcPr>
+            <w:tcW w:type="dxa" w:w="1008"/>
+          </w:tcPr>
+          <w:p>
+            <w:r>
+              <w:t>0.0000</w:t>
+            </w:r>
+          </w:p>
+        </w:tc>
+      </w:tr>
+      <w:tr>
+        <w:tc>
+          <w:tcPr>
+            <w:tcW w:type="dxa" w:w="3312"/>
+          </w:tcPr>
+          <w:p>
+            <w:r>
+              <w:t>labse_frozen minus final BM25</w:t>
+            </w:r>
+          </w:p>
+        </w:tc>
+        <w:tc>
+          <w:tcPr>
+            <w:tcW w:type="dxa" w:w="1296"/>
+          </w:tcPr>
+          <w:p>
+            <w:r>
+              <w:t>f1_macro</w:t>
+            </w:r>
+          </w:p>
+        </w:tc>
+        <w:tc>
+          <w:tcPr>
+            <w:tcW w:type="dxa" w:w="1584"/>
+          </w:tcPr>
+          <w:p>
+            <w:r>
+              <w:t>-0.1379</w:t>
+            </w:r>
+          </w:p>
+        </w:tc>
+        <w:tc>
+          <w:tcPr>
+            <w:tcW w:type="dxa" w:w="2304"/>
+          </w:tcPr>
+          <w:p>
+            <w:r>
+              <w:t>[-0.1528, -0.1233]</w:t>
+            </w:r>
+          </w:p>
+        </w:tc>
+        <w:tc>
+          <w:tcPr>
+            <w:tcW w:type="dxa" w:w="1008"/>
+          </w:tcPr>
+          <w:p>
+            <w:r>
+              <w:t>0.0000</w:t>
+            </w:r>
+          </w:p>
+        </w:tc>
+      </w:tr>
+      <w:tr>
+        <w:tc>
+          <w:tcPr>
+            <w:tcW w:type="dxa" w:w="3312"/>
+          </w:tcPr>
+          <w:p>
+            <w:r>
+              <w:t>labse_frozen minus final BM25</w:t>
+            </w:r>
+          </w:p>
+        </w:tc>
+        <w:tc>
+          <w:tcPr>
+            <w:tcW w:type="dxa" w:w="1296"/>
+          </w:tcPr>
+          <w:p>
+            <w:r>
+              <w:t>f1_micro</w:t>
+            </w:r>
+          </w:p>
+        </w:tc>
+        <w:tc>
+          <w:tcPr>
+            <w:tcW w:type="dxa" w:w="1584"/>
+          </w:tcPr>
+          <w:p>
+            <w:r>
+              <w:t>-0.1350</w:t>
+            </w:r>
+          </w:p>
+        </w:tc>
+        <w:tc>
+          <w:tcPr>
+            <w:tcW w:type="dxa" w:w="2304"/>
+          </w:tcPr>
+          <w:p>
+            <w:r>
+              <w:t>[-0.1469, -0.1226]</w:t>
+            </w:r>
+          </w:p>
+        </w:tc>
+        <w:tc>
+          <w:tcPr>
+            <w:tcW w:type="dxa" w:w="1008"/>
+          </w:tcPr>
+          <w:p>
+            <w:r>
+              <w:t>0.0000</w:t>
+            </w:r>
+          </w:p>
+        </w:tc>
+      </w:tr>
+    </w:tbl>
+    <w:p/>
     <w:p>
       <w:pPr>
         <w:pStyle w:val="Heading1"/>
@@ -4188,7 +5919,255 @@
         <w:pStyle w:val="Heading1"/>
       </w:pPr>
       <w:r>
-        <w:t>S9. Artifact index and reproduction</w:t>
+        <w:t>S9. Diagnostic figures</w:t>
+      </w:r>
+    </w:p>
+    <w:p>
+      <w:pPr>
+        <w:jc w:val="center"/>
+      </w:pPr>
+      <w:r>
+        <w:drawing>
+          <wp:inline xmlns:a="http://schemas.openxmlformats.org/drawingml/2006/main" xmlns:pic="http://schemas.openxmlformats.org/drawingml/2006/picture">
+            <wp:extent cx="6126480" cy="9802368"/>
+            <wp:docPr id="5" name="Picture 5"/>
+            <wp:cNvGraphicFramePr>
+              <a:graphicFrameLocks noChangeAspect="1"/>
+            </wp:cNvGraphicFramePr>
+            <a:graphic>
+              <a:graphicData uri="http://schemas.openxmlformats.org/drawingml/2006/picture">
+                <pic:pic>
+                  <pic:nvPicPr>
+                    <pic:cNvPr id="0" name="per_label_confusion_matrices.png"/>
+                    <pic:cNvPicPr/>
+                  </pic:nvPicPr>
+                  <pic:blipFill>
+                    <a:blip r:embed="rId13"/>
+                    <a:stretch>
+                      <a:fillRect/>
+                    </a:stretch>
+                  </pic:blipFill>
+                  <pic:spPr>
+                    <a:xfrm>
+                      <a:off x="0" y="0"/>
+                      <a:ext cx="6126480" cy="9802368"/>
+                    </a:xfrm>
+                    <a:prstGeom prst="rect"/>
+                  </pic:spPr>
+                </pic:pic>
+              </a:graphicData>
+            </a:graphic>
+          </wp:inline>
+        </w:drawing>
+      </w:r>
+    </w:p>
+    <w:p>
+      <w:pPr>
+        <w:pStyle w:val="Caption"/>
+        <w:jc w:val="center"/>
+      </w:pPr>
+      <w:r>
+        <w:t>Figure S5. One-vs-rest confusion matrices for all 37 subjects.</w:t>
+      </w:r>
+    </w:p>
+    <w:p>
+      <w:pPr>
+        <w:jc w:val="center"/>
+      </w:pPr>
+      <w:r>
+        <w:drawing>
+          <wp:inline xmlns:a="http://schemas.openxmlformats.org/drawingml/2006/main" xmlns:pic="http://schemas.openxmlformats.org/drawingml/2006/picture">
+            <wp:extent cx="6126480" cy="6126480"/>
+            <wp:docPr id="6" name="Picture 6"/>
+            <wp:cNvGraphicFramePr>
+              <a:graphicFrameLocks noChangeAspect="1"/>
+            </wp:cNvGraphicFramePr>
+            <a:graphic>
+              <a:graphicData uri="http://schemas.openxmlformats.org/drawingml/2006/picture">
+                <pic:pic>
+                  <pic:nvPicPr>
+                    <pic:cNvPr id="0" name="true_vs_predicted_support.png"/>
+                    <pic:cNvPicPr/>
+                  </pic:nvPicPr>
+                  <pic:blipFill>
+                    <a:blip r:embed="rId14"/>
+                    <a:stretch>
+                      <a:fillRect/>
+                    </a:stretch>
+                  </pic:blipFill>
+                  <pic:spPr>
+                    <a:xfrm>
+                      <a:off x="0" y="0"/>
+                      <a:ext cx="6126480" cy="6126480"/>
+                    </a:xfrm>
+                    <a:prstGeom prst="rect"/>
+                  </pic:spPr>
+                </pic:pic>
+              </a:graphicData>
+            </a:graphic>
+          </wp:inline>
+        </w:drawing>
+      </w:r>
+    </w:p>
+    <w:p>
+      <w:pPr>
+        <w:pStyle w:val="Caption"/>
+        <w:jc w:val="center"/>
+      </w:pPr>
+      <w:r>
+        <w:t>Figure S6. True versus predicted support by subject.</w:t>
+      </w:r>
+    </w:p>
+    <w:p>
+      <w:pPr>
+        <w:jc w:val="center"/>
+      </w:pPr>
+      <w:r>
+        <w:drawing>
+          <wp:inline xmlns:a="http://schemas.openxmlformats.org/drawingml/2006/main" xmlns:pic="http://schemas.openxmlformats.org/drawingml/2006/picture">
+            <wp:extent cx="6126480" cy="7253072"/>
+            <wp:docPr id="7" name="Picture 7"/>
+            <wp:cNvGraphicFramePr>
+              <a:graphicFrameLocks noChangeAspect="1"/>
+            </wp:cNvGraphicFramePr>
+            <a:graphic>
+              <a:graphicData uri="http://schemas.openxmlformats.org/drawingml/2006/picture">
+                <pic:pic>
+                  <pic:nvPicPr>
+                    <pic:cNvPr id="0" name="label_error_counts.png"/>
+                    <pic:cNvPicPr/>
+                  </pic:nvPicPr>
+                  <pic:blipFill>
+                    <a:blip r:embed="rId15"/>
+                    <a:stretch>
+                      <a:fillRect/>
+                    </a:stretch>
+                  </pic:blipFill>
+                  <pic:spPr>
+                    <a:xfrm>
+                      <a:off x="0" y="0"/>
+                      <a:ext cx="6126480" cy="7253072"/>
+                    </a:xfrm>
+                    <a:prstGeom prst="rect"/>
+                  </pic:spPr>
+                </pic:pic>
+              </a:graphicData>
+            </a:graphic>
+          </wp:inline>
+        </w:drawing>
+      </w:r>
+    </w:p>
+    <w:p>
+      <w:pPr>
+        <w:pStyle w:val="Caption"/>
+        <w:jc w:val="center"/>
+      </w:pPr>
+      <w:r>
+        <w:t>Figure S7. False-positive and false-negative counts by subject.</w:t>
+      </w:r>
+    </w:p>
+    <w:p>
+      <w:pPr>
+        <w:jc w:val="center"/>
+      </w:pPr>
+      <w:r>
+        <w:drawing>
+          <wp:inline xmlns:a="http://schemas.openxmlformats.org/drawingml/2006/main" xmlns:pic="http://schemas.openxmlformats.org/drawingml/2006/picture">
+            <wp:extent cx="5669280" cy="3543300"/>
+            <wp:docPr id="8" name="Picture 8"/>
+            <wp:cNvGraphicFramePr>
+              <a:graphicFrameLocks noChangeAspect="1"/>
+            </wp:cNvGraphicFramePr>
+            <a:graphic>
+              <a:graphicData uri="http://schemas.openxmlformats.org/drawingml/2006/picture">
+                <pic:pic>
+                  <pic:nvPicPr>
+                    <pic:cNvPr id="0" name="support_vs_f1.png"/>
+                    <pic:cNvPicPr/>
+                  </pic:nvPicPr>
+                  <pic:blipFill>
+                    <a:blip r:embed="rId16"/>
+                    <a:stretch>
+                      <a:fillRect/>
+                    </a:stretch>
+                  </pic:blipFill>
+                  <pic:spPr>
+                    <a:xfrm>
+                      <a:off x="0" y="0"/>
+                      <a:ext cx="5669280" cy="3543300"/>
+                    </a:xfrm>
+                    <a:prstGeom prst="rect"/>
+                  </pic:spPr>
+                </pic:pic>
+              </a:graphicData>
+            </a:graphic>
+          </wp:inline>
+        </w:drawing>
+      </w:r>
+    </w:p>
+    <w:p>
+      <w:pPr>
+        <w:pStyle w:val="Caption"/>
+        <w:jc w:val="center"/>
+      </w:pPr>
+      <w:r>
+        <w:t>Figure S8. Relationship between test support and subject-level F1.</w:t>
+      </w:r>
+    </w:p>
+    <w:p>
+      <w:pPr>
+        <w:jc w:val="center"/>
+      </w:pPr>
+      <w:r>
+        <w:drawing>
+          <wp:inline xmlns:a="http://schemas.openxmlformats.org/drawingml/2006/main" xmlns:pic="http://schemas.openxmlformats.org/drawingml/2006/picture">
+            <wp:extent cx="6126480" cy="6126480"/>
+            <wp:docPr id="9" name="Picture 9"/>
+            <wp:cNvGraphicFramePr>
+              <a:graphicFrameLocks noChangeAspect="1"/>
+            </wp:cNvGraphicFramePr>
+            <a:graphic>
+              <a:graphicData uri="http://schemas.openxmlformats.org/drawingml/2006/picture">
+                <pic:pic>
+                  <pic:nvPicPr>
+                    <pic:cNvPr id="0" name="label_cooccurrence_heatmap.png"/>
+                    <pic:cNvPicPr/>
+                  </pic:nvPicPr>
+                  <pic:blipFill>
+                    <a:blip r:embed="rId17"/>
+                    <a:stretch>
+                      <a:fillRect/>
+                    </a:stretch>
+                  </pic:blipFill>
+                  <pic:spPr>
+                    <a:xfrm>
+                      <a:off x="0" y="0"/>
+                      <a:ext cx="6126480" cy="6126480"/>
+                    </a:xfrm>
+                    <a:prstGeom prst="rect"/>
+                  </pic:spPr>
+                </pic:pic>
+              </a:graphicData>
+            </a:graphic>
+          </wp:inline>
+        </w:drawing>
+      </w:r>
+    </w:p>
+    <w:p>
+      <w:pPr>
+        <w:pStyle w:val="Caption"/>
+        <w:jc w:val="center"/>
+      </w:pPr>
+      <w:r>
+        <w:t>Figure S9. Label co-occurrence structure in the evaluation cohort.</w:t>
+      </w:r>
+    </w:p>
+    <w:p>
+      <w:pPr>
+        <w:pStyle w:val="Heading1"/>
+      </w:pPr>
+      <w:r>
+        <w:t>S10. Artifact index and reproduction</w:t>
       </w:r>
     </w:p>
     <w:p>

</xml_diff>

<commit_message>
Clarify DistilUSE and supervised classifier terminology
</commit_message>
<xml_diff>
--- a/paper_artifacts/CACIC_2026_Supplementary_Material.docx
+++ b/paper_artifacts/CACIC_2026_Supplementary_Material.docx
@@ -591,7 +591,7 @@
     </w:p>
     <w:p>
       <w:r>
-        <w:t>The primary validation set contains 233 candidates: 189 sparse configurations, 42 frozen dense configurations, and two fine-tuned transformers. Macro-F1 is the prespecified primary selection criterion; thresholds are estimated on the dedicated calibration partition.</w:t>
+        <w:t>The primary validation set contains 233 candidates: 189 sparse configurations, 42 fixed sentence-embedding configurations, and two supervised Transformer sequence classifiers. Macro-F1 is the prespecified primary selection criterion; thresholds are estimated on the dedicated calibration partition.</w:t>
       </w:r>
     </w:p>
     <w:p>
@@ -643,6 +643,11 @@
       </w:r>
     </w:p>
     <w:p>
+      <w:r>
+        <w:t>Dense-model terminology: historical sbert* identifiers denote DistilUSE. Fixed DistilUSE and LaBSE candidates use their complete, unchanged Sentence-Transformers pipelines. The supervised candidates instead initialize AutoModelForSequenceClassification from the Transformer module distributed with each checkpoint, create a new 37-output head, and jointly optimize backbone and head with class-weighted BCE. This is supervised sequence-classification fine-tuning, not contrastive sentence-embedding fine-tuning.</w:t>
+      </w:r>
+    </w:p>
+    <w:p>
       <w:pPr>
         <w:pStyle w:val="Heading1"/>
       </w:pPr>
@@ -1709,7 +1714,7 @@
           </w:tcPr>
           <w:p>
             <w:r>
-              <w:t>labse_finetuned</w:t>
+              <w:t>LaBSE-backbone sequence classifier</w:t>
             </w:r>
           </w:p>
         </w:tc>
@@ -1813,7 +1818,7 @@
           </w:tcPr>
           <w:p>
             <w:r>
-              <w:t>sbert_finetuned</w:t>
+              <w:t>DistilUSE-backbone sequence classifier</w:t>
             </w:r>
           </w:p>
         </w:tc>
@@ -1865,7 +1870,7 @@
           </w:tcPr>
           <w:p>
             <w:r>
-              <w:t>sbert_frozen</w:t>
+              <w:t>Fixed DistilUSE embeddings</w:t>
             </w:r>
           </w:p>
         </w:tc>
@@ -1917,7 +1922,7 @@
           </w:tcPr>
           <w:p>
             <w:r>
-              <w:t>labse_frozen</w:t>
+              <w:t>Fixed LaBSE embeddings</w:t>
             </w:r>
           </w:p>
         </w:tc>
@@ -2783,7 +2788,7 @@
           </w:tcPr>
           <w:p>
             <w:r>
-              <w:t>labse_finetuned minus final BM25</w:t>
+              <w:t>LaBSE-backbone sequence classifier minus final BM25</w:t>
             </w:r>
           </w:p>
         </w:tc>
@@ -2835,7 +2840,7 @@
           </w:tcPr>
           <w:p>
             <w:r>
-              <w:t>labse_finetuned minus final BM25</w:t>
+              <w:t>LaBSE-backbone sequence classifier minus final BM25</w:t>
             </w:r>
           </w:p>
         </w:tc>
@@ -2991,7 +2996,7 @@
           </w:tcPr>
           <w:p>
             <w:r>
-              <w:t>sbert_finetuned minus final BM25</w:t>
+              <w:t>DistilUSE-backbone sequence classifier minus final BM25</w:t>
             </w:r>
           </w:p>
         </w:tc>
@@ -3043,7 +3048,7 @@
           </w:tcPr>
           <w:p>
             <w:r>
-              <w:t>sbert_finetuned minus final BM25</w:t>
+              <w:t>DistilUSE-backbone sequence classifier minus final BM25</w:t>
             </w:r>
           </w:p>
         </w:tc>
@@ -3095,7 +3100,7 @@
           </w:tcPr>
           <w:p>
             <w:r>
-              <w:t>sbert_frozen minus final BM25</w:t>
+              <w:t>Fixed DistilUSE embeddings minus final BM25</w:t>
             </w:r>
           </w:p>
         </w:tc>
@@ -3147,7 +3152,7 @@
           </w:tcPr>
           <w:p>
             <w:r>
-              <w:t>sbert_frozen minus final BM25</w:t>
+              <w:t>Fixed DistilUSE embeddings minus final BM25</w:t>
             </w:r>
           </w:p>
         </w:tc>
@@ -3199,7 +3204,7 @@
           </w:tcPr>
           <w:p>
             <w:r>
-              <w:t>labse_frozen minus final BM25</w:t>
+              <w:t>Fixed LaBSE embeddings minus final BM25</w:t>
             </w:r>
           </w:p>
         </w:tc>
@@ -3251,7 +3256,7 @@
           </w:tcPr>
           <w:p>
             <w:r>
-              <w:t>labse_frozen minus final BM25</w:t>
+              <w:t>Fixed LaBSE embeddings minus final BM25</w:t>
             </w:r>
           </w:p>
         </w:tc>
@@ -3303,7 +3308,7 @@
         <w:pStyle w:val="Heading1"/>
       </w:pPr>
       <w:r>
-        <w:t>S7. Fine-tuning trajectories</w:t>
+        <w:t>S7. Supervised sequence-classification trajectories</w:t>
       </w:r>
     </w:p>
     <w:tbl>
@@ -3383,7 +3388,7 @@
           </w:tcPr>
           <w:p>
             <w:r>
-              <w:t>labse_finetuned</w:t>
+              <w:t>LaBSE-backbone sequence classifier</w:t>
             </w:r>
           </w:p>
         </w:tc>
@@ -3425,7 +3430,7 @@
           </w:tcPr>
           <w:p>
             <w:r>
-              <w:t>sbert_finetuned</w:t>
+              <w:t>DistilUSE-backbone sequence classifier</w:t>
             </w:r>
           </w:p>
         </w:tc>

</xml_diff>